<commit_message>
Adicionar o nome do professor ao relatório
Co-Authored-By: Claude Opus 5.5 <noreply@anthropic.com>
Claude-Session: https://claude.ai/code/session_014fTs8dtzxRsY7LvWp9edZr
</commit_message>
<xml_diff>
--- a/docs/relatorio.docx
+++ b/docs/relatorio.docx
@@ -231,19 +231,7 @@
         <w:t xml:space="preserve"> </w:t>
       </w:r>
       <w:r>
-        <w:t xml:space="preserve">Prof. [Nome</w:t>
-      </w:r>
-      <w:r>
-        <w:t xml:space="preserve"> </w:t>
-      </w:r>
-      <w:r>
-        <w:t xml:space="preserve">do</w:t>
-      </w:r>
-      <w:r>
-        <w:t xml:space="preserve"> </w:t>
-      </w:r>
-      <w:r>
-        <w:t xml:space="preserve">professor]</w:t>
+        <w:t xml:space="preserve">Prof. Maikol</w:t>
       </w:r>
       <w:r>
         <w:t xml:space="preserve"> </w:t>

</xml_diff>